<commit_message>
Screen kodu z 30.05
</commit_message>
<xml_diff>
--- a/dokumentacja.docx
+++ b/dokumentacja.docx
@@ -168,6 +168,54 @@
         <w:jc w:val="left"/>
         <w:rPr/>
       </w:pPr>
+      <w:r>
+        <w:drawing>
+          <wp:anchor distT="0" distB="0" distL="0" distR="0" simplePos="0" relativeHeight="2" behindDoc="0" locked="0" layoutInCell="0" allowOverlap="1">
+            <wp:simplePos x="0" y="0"/>
+            <wp:positionH relativeFrom="column">
+              <wp:posOffset>9525</wp:posOffset>
+            </wp:positionH>
+            <wp:positionV relativeFrom="paragraph">
+              <wp:posOffset>390525</wp:posOffset>
+            </wp:positionV>
+            <wp:extent cx="5760720" cy="2553970"/>
+            <wp:effectExtent l="0" t="0" r="0" b="0"/>
+            <wp:wrapSquare wrapText="largest"/>
+            <wp:docPr id="1" name="Obraz1"/>
+            <wp:cNvGraphicFramePr>
+              <a:graphicFrameLocks xmlns:a="http://schemas.openxmlformats.org/drawingml/2006/main" noChangeAspect="1"/>
+            </wp:cNvGraphicFramePr>
+            <a:graphic xmlns:a="http://schemas.openxmlformats.org/drawingml/2006/main">
+              <a:graphicData uri="http://schemas.openxmlformats.org/drawingml/2006/picture">
+                <pic:pic xmlns:pic="http://schemas.openxmlformats.org/drawingml/2006/picture">
+                  <pic:nvPicPr>
+                    <pic:cNvPr id="1" name="Obraz1"/>
+                    <pic:cNvPicPr>
+                      <a:picLocks noChangeAspect="1" noChangeArrowheads="1"/>
+                    </pic:cNvPicPr>
+                  </pic:nvPicPr>
+                  <pic:blipFill>
+                    <a:blip r:embed="rId2"/>
+                    <a:stretch>
+                      <a:fillRect/>
+                    </a:stretch>
+                  </pic:blipFill>
+                  <pic:spPr bwMode="auto">
+                    <a:xfrm>
+                      <a:off x="0" y="0"/>
+                      <a:ext cx="5760720" cy="2553970"/>
+                    </a:xfrm>
+                    <a:prstGeom prst="rect">
+                      <a:avLst/>
+                    </a:prstGeom>
+                    <a:noFill/>
+                  </pic:spPr>
+                </pic:pic>
+              </a:graphicData>
+            </a:graphic>
+          </wp:anchor>
+        </w:drawing>
+      </w:r>
       <w:r>
         <w:rPr/>
         <w:t>30.05/Dziś nie zrobiłem nic ciekawego. Dodałem jedynie wstęp do gry.   Dzisiaj nie użyłem Chata GPT.</w:t>
@@ -790,8 +838,8 @@
     <w:qFormat/>
     <w:rPr/>
   </w:style>
-  <w:style w:type="character" w:styleId="Znakiwypunktowania">
-    <w:name w:val="Znaki wypunktowania"/>
+  <w:style w:type="character" w:styleId="Znakiwypunktowaniauser">
+    <w:name w:val="Znaki wypunktowania (user)"/>
     <w:qFormat/>
     <w:rPr>
       <w:rFonts w:ascii="OpenSymbol" w:hAnsi="OpenSymbol" w:eastAsia="OpenSymbol" w:cs="OpenSymbol"/>
@@ -881,8 +929,8 @@
       <w:rFonts w:cs="Arial"/>
     </w:rPr>
   </w:style>
-  <w:style w:type="numbering" w:styleId="Bezlisty" w:default="1">
-    <w:name w:val="Bez listy"/>
+  <w:style w:type="numbering" w:styleId="Bezlistyuser" w:default="1">
+    <w:name w:val="Bez listy (user)"/>
     <w:uiPriority w:val="99"/>
     <w:semiHidden/>
     <w:unhideWhenUsed/>

</xml_diff>